<commit_message>
Remove disclosure material from paper package
Drop the standalone disclosure document and the disclosure sections from the
manuscript and cover letter; rebuild the Word and HTML outputs.
</commit_message>
<xml_diff>
--- a/paper/Space_DataCenter_Paper.docx
+++ b/paper/Space_DataCenter_Paper.docx
@@ -28,7 +28,7 @@
         </w:p>
       </w:sdtContent>
     </w:sdt>
-    <w:bookmarkStart w:id="24" w:name="Xb1960cd456b85f7b2038cff64b0c17572edfa3a"/>
+    <w:bookmarkStart w:id="23" w:name="Xb1960cd456b85f7b2038cff64b0c17572edfa3a"/>
     <w:p>
       <w:pPr>
         <w:pStyle w:val="Heading1"/>
@@ -451,13 +451,7 @@
         <w:t xml:space="preserve"> </w:t>
       </w:r>
       <w:r>
-        <w:t xml:space="preserve">The use of generative AI as a drafting aid, and the independent verification of all equations, are</w:t>
-      </w:r>
-      <w:r>
-        <w:t xml:space="preserve"> </w:t>
-      </w:r>
-      <w:r>
-        <w:t xml:space="preserve">described in the accompanying disclosure.</w:t>
+        <w:t xml:space="preserve">All equations were independently verified against the cited primary sources.</w:t>
       </w:r>
     </w:p>
     <w:bookmarkEnd w:id="11"/>
@@ -1139,13 +1133,13 @@
       </w:r>
     </w:p>
     <w:bookmarkEnd w:id="21"/>
-    <w:bookmarkStart w:id="22" w:name="disclosure"/>
+    <w:bookmarkStart w:id="22" w:name="references"/>
     <w:p>
       <w:pPr>
         <w:pStyle w:val="Heading2"/>
       </w:pPr>
       <w:r>
-        <w:t xml:space="preserve">Disclosure</w:t>
+        <w:t xml:space="preserve">References</w:t>
       </w:r>
     </w:p>
     <w:p>
@@ -1153,71 +1147,41 @@
         <w:pStyle w:val="FirstParagraph"/>
       </w:pPr>
       <w:r>
-        <w:t xml:space="preserve">See the accompanying methods and AI-use disclosure. Generative AI was used as a drafting aid; all</w:t>
-      </w:r>
-      <w:r>
-        <w:t xml:space="preserve"> </w:t>
-      </w:r>
-      <w:r>
-        <w:t xml:space="preserve">quantitative claims are produced by the open code or cited primary sources, all equations were</w:t>
-      </w:r>
-      <w:r>
-        <w:t xml:space="preserve"> </w:t>
-      </w:r>
-      <w:r>
-        <w:t xml:space="preserve">independently verified, and the author is solely responsible for the content.</w:t>
+        <w:t xml:space="preserve">A full, categorized bibliography of thirty-five sources, including Curtis and Vallado (astrodynamics),</w:t>
+      </w:r>
+      <w:r>
+        <w:t xml:space="preserve"> </w:t>
+      </w:r>
+      <w:r>
+        <w:t xml:space="preserve">the NRLMSIS atmosphere model, the AE/AP and SHIELDOSE radiation models, NASA ORDEM and ESA MASTER</w:t>
+      </w:r>
+      <w:r>
+        <w:t xml:space="preserve"> </w:t>
+      </w:r>
+      <w:r>
+        <w:t xml:space="preserve">debris tools, Kessler and Cour-Palais and Klinkrad (debris cascade), Hemmati and the free-space</w:t>
+      </w:r>
+      <w:r>
+        <w:t xml:space="preserve"> </w:t>
+      </w:r>
+      <w:r>
+        <w:t xml:space="preserve">optical link-budget literature, Gilmore and Incropera (thermal), Sutton and Biblarz (propulsion), the</w:t>
+      </w:r>
+      <w:r>
+        <w:t xml:space="preserve"> </w:t>
+      </w:r>
+      <w:r>
+        <w:t xml:space="preserve">SMAD systems texts, the FCC disposal rule, and the reference-architecture preprint (arXiv:2511.19468),</w:t>
+      </w:r>
+      <w:r>
+        <w:t xml:space="preserve"> </w:t>
+      </w:r>
+      <w:r>
+        <w:t xml:space="preserve">is provided in the accompanying monograph and repository.</w:t>
       </w:r>
     </w:p>
     <w:bookmarkEnd w:id="22"/>
-    <w:bookmarkStart w:id="23" w:name="references"/>
-    <w:p>
-      <w:pPr>
-        <w:pStyle w:val="Heading2"/>
-      </w:pPr>
-      <w:r>
-        <w:t xml:space="preserve">References</w:t>
-      </w:r>
-    </w:p>
-    <w:p>
-      <w:pPr>
-        <w:pStyle w:val="FirstParagraph"/>
-      </w:pPr>
-      <w:r>
-        <w:t xml:space="preserve">A full, categorized bibliography of thirty-five sources, including Curtis and Vallado (astrodynamics),</w:t>
-      </w:r>
-      <w:r>
-        <w:t xml:space="preserve"> </w:t>
-      </w:r>
-      <w:r>
-        <w:t xml:space="preserve">the NRLMSIS atmosphere model, the AE/AP and SHIELDOSE radiation models, NASA ORDEM and ESA MASTER</w:t>
-      </w:r>
-      <w:r>
-        <w:t xml:space="preserve"> </w:t>
-      </w:r>
-      <w:r>
-        <w:t xml:space="preserve">debris tools, Kessler and Cour-Palais and Klinkrad (debris cascade), Hemmati and the free-space</w:t>
-      </w:r>
-      <w:r>
-        <w:t xml:space="preserve"> </w:t>
-      </w:r>
-      <w:r>
-        <w:t xml:space="preserve">optical link-budget literature, Gilmore and Incropera (thermal), Sutton and Biblarz (propulsion), the</w:t>
-      </w:r>
-      <w:r>
-        <w:t xml:space="preserve"> </w:t>
-      </w:r>
-      <w:r>
-        <w:t xml:space="preserve">SMAD systems texts, the FCC disposal rule, and the reference-architecture preprint (arXiv:2511.19468),</w:t>
-      </w:r>
-      <w:r>
-        <w:t xml:space="preserve"> </w:t>
-      </w:r>
-      <w:r>
-        <w:t xml:space="preserve">is provided in the accompanying monograph and repository.</w:t>
-      </w:r>
-    </w:p>
     <w:bookmarkEnd w:id="23"/>
-    <w:bookmarkEnd w:id="24"/>
     <w:sectPr>
       <w:footnotePr>
         <w:numRestart w:val="eachSect"/>

</xml_diff>